<commit_message>
Final exam on 305 switched
</commit_message>
<xml_diff>
--- a/W26-Phil305-site/syllabus-W26-305.docx
+++ b/W26-Phil305-site/syllabus-W26-305.docx
@@ -552,7 +552,7 @@
       </w:r>
     </w:p>
     <w:bookmarkEnd w:id="29"/>
-    <w:bookmarkStart w:id="71" w:name="class-schedule"/>
+    <w:bookmarkStart w:id="72" w:name="class-schedule"/>
     <w:p>
       <w:pPr>
         <w:pStyle w:val="Heading1"/>
@@ -2124,18 +2124,44 @@
         <w:t xml:space="preserve">: Assignment 11 due Thursday, April 16 at 5pm.</w:t>
       </w:r>
     </w:p>
-    <w:p>
-      <w:pPr>
-        <w:pStyle w:val="BodyText"/>
-      </w:pPr>
-      <w:r>
-        <w:t xml:space="preserve">There will be a revision class on Monday, April 20, with no new material, to go over the sample exam.</w:t>
-      </w:r>
-    </w:p>
     <w:bookmarkEnd w:id="69"/>
     <w:bookmarkEnd w:id="70"/>
+    <w:bookmarkStart w:id="71" w:name="final-exam"/>
+    <w:p>
+      <w:pPr>
+        <w:pStyle w:val="Heading2"/>
+      </w:pPr>
+      <w:r>
+        <w:t xml:space="preserve">FINAL EXAM</w:t>
+      </w:r>
+    </w:p>
+    <w:p>
+      <w:pPr>
+        <w:pStyle w:val="FirstParagraph"/>
+      </w:pPr>
+      <w:r>
+        <w:t xml:space="preserve">The final will be on Monday, April 20, in class, with space at the testing accommodation center for people who have accommodations. It will cover material from the</w:t>
+      </w:r>
+      <w:r>
+        <w:t xml:space="preserve"> </w:t>
+      </w:r>
+      <w:r>
+        <w:rPr>
+          <w:b/>
+          <w:bCs/>
+        </w:rPr>
+        <w:t xml:space="preserve">second half</w:t>
+      </w:r>
+      <w:r>
+        <w:t xml:space="preserve"> </w:t>
+      </w:r>
+      <w:r>
+        <w:t xml:space="preserve">of the course.</w:t>
+      </w:r>
+    </w:p>
     <w:bookmarkEnd w:id="71"/>
-    <w:bookmarkStart w:id="72" w:name="extensions"/>
+    <w:bookmarkEnd w:id="72"/>
+    <w:bookmarkStart w:id="73" w:name="extensions"/>
     <w:p>
       <w:pPr>
         <w:pStyle w:val="Heading1"/>
@@ -2160,8 +2186,8 @@
         <w:t xml:space="preserve">That’s why we’re only counting the best 9 out of 11 assignments. People who are sick, or have other obligations, can skip up to two assignments without penalty.</w:t>
       </w:r>
     </w:p>
-    <w:bookmarkEnd w:id="72"/>
-    <w:bookmarkStart w:id="75" w:name="plagiarism"/>
+    <w:bookmarkEnd w:id="73"/>
+    <w:bookmarkStart w:id="76" w:name="plagiarism"/>
     <w:p>
       <w:pPr>
         <w:pStyle w:val="Heading1"/>
@@ -2180,7 +2206,7 @@
       <w:r>
         <w:t xml:space="preserve"> </w:t>
       </w:r>
-      <w:hyperlink r:id="rId73">
+      <w:hyperlink r:id="rId74">
         <w:r>
           <w:rPr>
             <w:rStyle w:val="Hyperlink"/>
@@ -2210,7 +2236,7 @@
       <w:r>
         <w:t xml:space="preserve"> </w:t>
       </w:r>
-      <w:hyperlink r:id="rId74">
+      <w:hyperlink r:id="rId75">
         <w:r>
           <w:rPr>
             <w:rStyle w:val="Hyperlink"/>
@@ -2222,8 +2248,8 @@
         <w:t xml:space="preserve">. Violations of these policies will be reported to the Office of the Assistant Dean for Student Academic Affairs, and sanctioned with a course grade of F.</w:t>
       </w:r>
     </w:p>
-    <w:bookmarkEnd w:id="75"/>
-    <w:bookmarkStart w:id="77" w:name="disability"/>
+    <w:bookmarkEnd w:id="76"/>
+    <w:bookmarkStart w:id="78" w:name="disability"/>
     <w:p>
       <w:pPr>
         <w:pStyle w:val="Heading1"/>
@@ -2258,7 +2284,7 @@
       <w:r>
         <w:t xml:space="preserve"> </w:t>
       </w:r>
-      <w:hyperlink r:id="rId76">
+      <w:hyperlink r:id="rId77">
         <w:r>
           <w:rPr>
             <w:rStyle w:val="Hyperlink"/>
@@ -2270,7 +2296,7 @@
         <w:t xml:space="preserve">.</w:t>
       </w:r>
     </w:p>
-    <w:bookmarkEnd w:id="77"/>
+    <w:bookmarkEnd w:id="78"/>
     <w:sectPr>
       <w:footnotePr>
         <w:numRestart w:val="eachSect"/>

</xml_diff>